<commit_message>
README for reviewers: Kravii overview, run it with one command, review it with an AI assistant (AGENTS.md: claims mapped to code, tests and chain, known limits); current architecture; known risks updated for the self-hosted setup
Co-Authored-By: Claude Opus 5.5 <noreply@anthropic.com>
</commit_message>
<xml_diff>
--- a/docs/Kravii-Security.docx
+++ b/docs/Kravii-Security.docx
@@ -5291,7 +5291,7 @@
                 <w:b w:val="0"/>
                 <w:sz w:val="18"/>
               </w:rPr>
-              <w:t>, on a home PC reached through Tailscale Funnel</w:t>
+              <w:t>, and the web app, database and validator run on one machine (Docker, behind a Cloudflare Tunnel)</w:t>
             </w:r>
           </w:p>
         </w:tc>
@@ -5996,7 +5996,7 @@
                 <w:b w:val="0"/>
                 <w:sz w:val="18"/>
               </w:rPr>
-              <w:t>, 101 tests, internal audit (</w:t>
+              <w:t>, 102 tests, internal audit (</w:t>
             </w:r>
             <w:r>
               <w:rPr>
@@ -6208,7 +6208,7 @@
                 <w:b w:val="0"/>
                 <w:sz w:val="18"/>
               </w:rPr>
-              <w:t xml:space="preserve"> (Neon, one schema per deployment)</w:t>
+              <w:t xml:space="preserve"> (one PostgreSQL for every tester)</w:t>
             </w:r>
           </w:p>
         </w:tc>

</xml_diff>